<commit_message>
added updated resume files and refresh professional experience details in index.html
</commit_message>
<xml_diff>
--- a/assets/resume/Anatoly Makeyev - Automation Engineer.docx
+++ b/assets/resume/Anatoly Makeyev - Automation Engineer.docx
@@ -366,33 +366,7 @@
           <w:szCs w:val="20"/>
           <w:shd w:fill="FFFFFF" w:val="clear"/>
         </w:rPr>
-        <w:t>Developing and maintaining scripts in a page object model using Oxygen, Java, Selenium, playwright on all sorts of websites as well as SaaS apps including Dynamics CRM &amp; Salesforce.</w:t>
-      </w:r>
-      <w:r>
-        <w:rPr>
-          <w:rFonts w:cs="Segoe UI" w:ascii="Segoe UI Variable Display" w:hAnsi="Segoe UI Variable Display"/>
-          <w:sz w:val="20"/>
-          <w:szCs w:val="20"/>
-        </w:rPr>
-        <w:br/>
-      </w:r>
-      <w:r>
-        <w:rPr>
-          <w:rFonts w:cs="Cambria Math" w:ascii="Segoe UI Variable Display" w:hAnsi="Segoe UI Variable Display"/>
-          <w:sz w:val="20"/>
-          <w:szCs w:val="20"/>
-          <w:shd w:fill="FFFFFF" w:val="clear"/>
-        </w:rPr>
-        <w:t>⦁</w:t>
-      </w:r>
-      <w:r>
-        <w:rPr>
-          <w:rFonts w:cs="Segoe UI" w:ascii="Segoe UI Variable Display" w:hAnsi="Segoe UI Variable Display"/>
-          <w:sz w:val="20"/>
-          <w:szCs w:val="20"/>
-          <w:shd w:fill="FFFFFF" w:val="clear"/>
-        </w:rPr>
-        <w:t xml:space="preserve"> Helping various customers to implement test automation from scratch in their organization.</w:t>
+        <w:t>Developing and maintaining scripts in a page object model.</w:t>
       </w:r>
     </w:p>
     <w:p>
@@ -430,7 +404,118 @@
           <w:szCs w:val="20"/>
           <w:shd w:fill="FFFFFF" w:val="clear"/>
         </w:rPr>
-        <w:t>Instructing QA teams on Cloudbeat, Oxygen, web &amp; mobile automation best practices.</w:t>
+        <w:t>U</w:t>
+      </w:r>
+      <w:r>
+        <w:rPr>
+          <w:rFonts w:cs="Segoe UI" w:ascii="Segoe UI Variable Display" w:hAnsi="Segoe UI Variable Display"/>
+          <w:sz w:val="20"/>
+          <w:szCs w:val="20"/>
+          <w:shd w:fill="FFFFFF" w:val="clear"/>
+        </w:rPr>
+        <w:t>sing Playwright  in TypeScript and Selenium in Python on various SaaS applications.</w:t>
+      </w:r>
+    </w:p>
+    <w:p>
+      <w:pPr>
+        <w:pStyle w:val="HTMLPreformatted"/>
+        <w:shd w:val="clear" w:color="auto" w:fill="FFFFFF"/>
+        <w:rPr>
+          <w:rFonts w:ascii="Segoe UI Variable Display" w:hAnsi="Segoe UI Variable Display"/>
+          <w:sz w:val="20"/>
+          <w:szCs w:val="20"/>
+        </w:rPr>
+      </w:pPr>
+      <w:r>
+        <w:rPr>
+          <w:rFonts w:cs="Cambria Math" w:ascii="Segoe UI Variable Display" w:hAnsi="Segoe UI Variable Display"/>
+          <w:sz w:val="20"/>
+          <w:szCs w:val="20"/>
+          <w:shd w:fill="FFFFFF" w:val="clear"/>
+        </w:rPr>
+        <w:t>⦁</w:t>
+      </w:r>
+      <w:r>
+        <w:rPr>
+          <w:rFonts w:cs="Segoe UI" w:ascii="Segoe UI Variable Display" w:hAnsi="Segoe UI Variable Display"/>
+          <w:sz w:val="20"/>
+          <w:szCs w:val="20"/>
+          <w:shd w:fill="FFFFFF" w:val="clear"/>
+        </w:rPr>
+        <w:t xml:space="preserve"> </w:t>
+      </w:r>
+      <w:r>
+        <w:rPr>
+          <w:rFonts w:cs="Segoe UI" w:ascii="Segoe UI Variable Display" w:hAnsi="Segoe UI Variable Display"/>
+          <w:sz w:val="20"/>
+          <w:szCs w:val="20"/>
+          <w:shd w:fill="FFFFFF" w:val="clear"/>
+        </w:rPr>
+        <w:t>Integrating system based scripts, CI/CD workflows and managing version control using Git.</w:t>
+      </w:r>
+      <w:r>
+        <w:rPr>
+          <w:rFonts w:cs="Segoe UI" w:ascii="Segoe UI Variable Display" w:hAnsi="Segoe UI Variable Display"/>
+          <w:sz w:val="20"/>
+          <w:szCs w:val="20"/>
+        </w:rPr>
+        <w:br/>
+      </w:r>
+      <w:r>
+        <w:rPr>
+          <w:rFonts w:cs="Cambria Math" w:ascii="Segoe UI Variable Display" w:hAnsi="Segoe UI Variable Display"/>
+          <w:sz w:val="20"/>
+          <w:szCs w:val="20"/>
+          <w:shd w:fill="FFFFFF" w:val="clear"/>
+        </w:rPr>
+        <w:t>⦁</w:t>
+      </w:r>
+      <w:r>
+        <w:rPr>
+          <w:rFonts w:cs="Segoe UI" w:ascii="Segoe UI Variable Display" w:hAnsi="Segoe UI Variable Display"/>
+          <w:sz w:val="20"/>
+          <w:szCs w:val="20"/>
+          <w:shd w:fill="FFFFFF" w:val="clear"/>
+        </w:rPr>
+        <w:t xml:space="preserve"> Helping various customers to implement test automation infrastructure in their organization.</w:t>
+      </w:r>
+    </w:p>
+    <w:p>
+      <w:pPr>
+        <w:pStyle w:val="HTMLPreformatted"/>
+        <w:shd w:val="clear" w:color="auto" w:fill="FFFFFF"/>
+        <w:rPr>
+          <w:rFonts w:ascii="Segoe UI Variable Display" w:hAnsi="Segoe UI Variable Display"/>
+          <w:sz w:val="20"/>
+          <w:szCs w:val="20"/>
+        </w:rPr>
+      </w:pPr>
+      <w:r>
+        <w:rPr>
+          <w:rFonts w:cs="Cambria Math" w:ascii="Segoe UI Variable Display" w:hAnsi="Segoe UI Variable Display"/>
+          <w:sz w:val="20"/>
+          <w:szCs w:val="20"/>
+          <w:shd w:fill="FFFFFF" w:val="clear"/>
+        </w:rPr>
+        <w:t>⦁</w:t>
+      </w:r>
+      <w:r>
+        <w:rPr>
+          <w:rFonts w:cs="Segoe UI" w:ascii="Segoe UI Variable Display" w:hAnsi="Segoe UI Variable Display"/>
+          <w:sz w:val="20"/>
+          <w:szCs w:val="20"/>
+          <w:shd w:fill="FFFFFF" w:val="clear"/>
+        </w:rPr>
+        <w:t xml:space="preserve"> </w:t>
+      </w:r>
+      <w:r>
+        <w:rPr>
+          <w:rFonts w:cs="Segoe UI" w:ascii="Segoe UI Variable Display" w:hAnsi="Segoe UI Variable Display"/>
+          <w:sz w:val="20"/>
+          <w:szCs w:val="20"/>
+          <w:shd w:fill="FFFFFF" w:val="clear"/>
+        </w:rPr>
+        <w:t>Instructing QA teams on web &amp; mobile automation best practices and pipeline management.</w:t>
       </w:r>
     </w:p>
     <w:p>
@@ -469,7 +554,7 @@
           <w:szCs w:val="20"/>
           <w:shd w:fill="FFFFFF" w:val="clear"/>
         </w:rPr>
-        <w:t>Creating automated tests for native and hybrid mobile apps using Appium with Oxygen.</w:t>
+        <w:t>Creating automated tests for native and hybrid mobile apps using Appium and Selenium.</w:t>
       </w:r>
       <w:r>
         <w:rPr>
@@ -495,33 +580,7 @@
           <w:szCs w:val="20"/>
           <w:shd w:fill="FFFFFF" w:val="clear"/>
         </w:rPr>
-        <w:t xml:space="preserve"> Building SOAP and REST API performance tests using JMeter and Postman.</w:t>
-      </w:r>
-      <w:r>
-        <w:rPr>
-          <w:rFonts w:cs="Segoe UI" w:ascii="Segoe UI Variable Display" w:hAnsi="Segoe UI Variable Display"/>
-          <w:sz w:val="20"/>
-          <w:szCs w:val="20"/>
-        </w:rPr>
-        <w:br/>
-      </w:r>
-      <w:r>
-        <w:rPr>
-          <w:rFonts w:cs="Cambria Math" w:ascii="Segoe UI Variable Display" w:hAnsi="Segoe UI Variable Display"/>
-          <w:sz w:val="20"/>
-          <w:szCs w:val="20"/>
-          <w:shd w:fill="FFFFFF" w:val="clear"/>
-        </w:rPr>
-        <w:t>⦁</w:t>
-      </w:r>
-      <w:r>
-        <w:rPr>
-          <w:rFonts w:cs="Segoe UI" w:ascii="Segoe UI Variable Display" w:hAnsi="Segoe UI Variable Display"/>
-          <w:sz w:val="20"/>
-          <w:szCs w:val="20"/>
-          <w:shd w:fill="FFFFFF" w:val="clear"/>
-        </w:rPr>
-        <w:t xml:space="preserve"> Managing version control using Git with Github and Bitbucket.</w:t>
+        <w:t xml:space="preserve"> Building SOAP and REST API, database, and performance tests using JMeter and Postman.</w:t>
       </w:r>
     </w:p>
     <w:p>
@@ -541,7 +600,7 @@
           <w:sz w:val="20"/>
           <w:szCs w:val="20"/>
         </w:rPr>
-        <w:t>Quality Assurance</w:t>
+        <w:t>QA</w:t>
       </w:r>
       <w:r>
         <w:rPr>
@@ -1111,17 +1170,7 @@
           <w:sz w:val="20"/>
           <w:szCs w:val="20"/>
         </w:rPr>
-        <w:t xml:space="preserve">Test Automation &amp; </w:t>
-      </w:r>
-      <w:r>
-        <w:rPr>
-          <w:rFonts w:cs="Segoe UI" w:ascii="Arial" w:hAnsi="Arial"/>
-          <w:b/>
-          <w:bCs/>
-          <w:sz w:val="20"/>
-          <w:szCs w:val="20"/>
-        </w:rPr>
-        <w:t xml:space="preserve">Software Quality Assurance, </w:t>
+        <w:t xml:space="preserve">Test Automation &amp; Software Quality Assurance, </w:t>
       </w:r>
       <w:hyperlink r:id="rId14">
         <w:r>
@@ -1145,26 +1194,7 @@
           <w:sz w:val="20"/>
           <w:szCs w:val="20"/>
         </w:rPr>
-        <w:t xml:space="preserve">                      </w:t>
-      </w:r>
-      <w:r>
-        <w:rPr>
-          <w:rFonts w:cs="Segoe UI" w:ascii="Arial" w:hAnsi="Arial"/>
-          <w:b/>
-          <w:bCs/>
-          <w:sz w:val="20"/>
-          <w:szCs w:val="20"/>
-        </w:rPr>
-        <w:t>2018 - 2019</w:t>
-      </w:r>
-      <w:r>
-        <w:rPr>
-          <w:rFonts w:cs="Segoe UI" w:ascii="Arial" w:hAnsi="Arial"/>
-          <w:b/>
-          <w:bCs/>
-          <w:sz w:val="20"/>
-          <w:szCs w:val="20"/>
-        </w:rPr>
+        <w:t xml:space="preserve">                      2018 - 2019</w:t>
         <w:tab/>
         <w:t xml:space="preserve">       </w:t>
       </w:r>
@@ -1431,7 +1461,16 @@
           <w:sz w:val="20"/>
           <w:szCs w:val="20"/>
         </w:rPr>
-        <w:t xml:space="preserve">HTML, CSS, JavaScript, Node, React, SQL, Java, Python, </w:t>
+        <w:t xml:space="preserve">HTML, CSS, JavaScript, TypeScript Node, React, SQL, Java, Python, MongoDB, </w:t>
+      </w:r>
+      <w:r>
+        <w:rPr>
+          <w:rFonts w:cs="Segoe UI" w:ascii="Segoe UI Variable Display" w:hAnsi="Segoe UI Variable Display"/>
+          <w:color w:val="24292F"/>
+          <w:sz w:val="20"/>
+          <w:szCs w:val="20"/>
+        </w:rPr>
+        <w:t xml:space="preserve">Firebase, </w:t>
       </w:r>
       <w:r>
         <w:rPr>
@@ -1439,48 +1478,7 @@
           <w:sz w:val="20"/>
           <w:szCs w:val="20"/>
         </w:rPr>
-        <w:t xml:space="preserve">Redis, </w:t>
-      </w:r>
-      <w:r>
-        <w:rPr>
-          <w:rFonts w:ascii="Segoe UI Variable Display" w:hAnsi="Segoe UI Variable Display"/>
-          <w:sz w:val="20"/>
-          <w:szCs w:val="20"/>
-        </w:rPr>
-        <w:t xml:space="preserve">MongoDB, </w:t>
-      </w:r>
-      <w:r>
-        <w:rPr>
-          <w:rFonts w:cs="Segoe UI" w:ascii="Segoe UI Variable Display" w:hAnsi="Segoe UI Variable Display"/>
-          <w:color w:val="24292F"/>
-          <w:sz w:val="20"/>
-          <w:szCs w:val="20"/>
-        </w:rPr>
-        <w:t xml:space="preserve">Firebase, </w:t>
-      </w:r>
-      <w:r>
-        <w:rPr>
-          <w:rFonts w:ascii="Segoe UI Variable Display" w:hAnsi="Segoe UI Variable Display"/>
-          <w:sz w:val="20"/>
-          <w:szCs w:val="20"/>
-        </w:rPr>
-        <w:t xml:space="preserve">Git, </w:t>
-      </w:r>
-      <w:r>
-        <w:rPr>
-          <w:rFonts w:ascii="Segoe UI Variable Display" w:hAnsi="Segoe UI Variable Display"/>
-          <w:sz w:val="20"/>
-          <w:szCs w:val="20"/>
-        </w:rPr>
-        <w:t xml:space="preserve">Github Actions, Jenkins, Docker, </w:t>
-      </w:r>
-      <w:r>
-        <w:rPr>
-          <w:rFonts w:ascii="Segoe UI Variable Display" w:hAnsi="Segoe UI Variable Display"/>
-          <w:sz w:val="20"/>
-          <w:szCs w:val="20"/>
-        </w:rPr>
-        <w:t>Selenium, Appium, Postman, JMeter, Playwright.</w:t>
+        <w:t>Git, Github Actions, Jenkins, Docker, Selenium, Appium, Postman, JMeter, Playwright.</w:t>
       </w:r>
     </w:p>
     <w:p>

</xml_diff>